<commit_message>
docs: align beta13 manual with verified release flow
</commit_message>
<xml_diff>
--- a/docs/AI_PRONOTE_v1.5_Beta13_사용설명서.docx
+++ b/docs/AI_PRONOTE_v1.5_Beta13_사용설명서.docx
@@ -849,7 +849,7 @@
           <w:color w:val="111111"/>
           <w:sz w:val="19"/>
         </w:rPr>
-        <w:t>AI_PRONOTE_설치하기.cmd</w:t>
+        <w:t>1_FIRST_SETUP.cmd</w:t>
       </w:r>
       <w:r>
         <w:rPr>
@@ -859,7 +859,7 @@
           <w:color w:val="242424"/>
           <w:sz w:val="20"/>
         </w:rPr>
-        <w:t>를 더블클릭합니다.</w:t>
+        <w:t>를 더블클릭합니다. Python 3.12 64비트가 필요합니다.</w:t>
       </w:r>
     </w:p>
     <w:p>
@@ -1009,7 +1009,7 @@
           <w:color w:val="111111"/>
           <w:sz w:val="19"/>
         </w:rPr>
-        <w:t>AI_PRONOTE_설치하기.command</w:t>
+        <w:t>setup_mac.command</w:t>
       </w:r>
       <w:r>
         <w:rPr>
@@ -1039,7 +1039,7 @@
           <w:color w:val="242424"/>
           <w:sz w:val="20"/>
         </w:rPr>
-        <w:t>를 선택합니다.</w:t>
+        <w:t>를 선택합니다. Python 3.12가 필요합니다.</w:t>
       </w:r>
     </w:p>
     <w:p>
@@ -4284,7 +4284,7 @@
           <w:color w:val="111111"/>
           <w:sz w:val="19"/>
         </w:rPr>
-        <w:t>설정 · 어드민</w:t>
+        <w:t>설정</w:t>
       </w:r>
       <w:r>
         <w:rPr>
@@ -4304,7 +4304,7 @@
           <w:color w:val="111111"/>
           <w:sz w:val="19"/>
         </w:rPr>
-        <w:t>공식 API 연결</w:t>
+        <w:t>AI 연결 · 개인 API 키</w:t>
       </w:r>
       <w:r>
         <w:rPr>
@@ -4314,7 +4314,7 @@
           <w:color w:val="242424"/>
           <w:sz w:val="20"/>
         </w:rPr>
-        <w:t>을 엽니다.</w:t>
+        <w:t>를 엽니다.</w:t>
       </w:r>
     </w:p>
     <w:p>
@@ -4376,7 +4376,7 @@
           <w:color w:val="111111"/>
           <w:sz w:val="19"/>
         </w:rPr>
-        <w:t>연결 확인</w:t>
+        <w:t>키 저장·연결</w:t>
       </w:r>
       <w:r>
         <w:rPr>
@@ -4386,7 +4386,7 @@
           <w:color w:val="242424"/>
           <w:sz w:val="20"/>
         </w:rPr>
-        <w:t>을 실행합니다.</w:t>
+        <w:t>을 누릅니다.</w:t>
       </w:r>
     </w:p>
     <w:p>
@@ -4412,11 +4412,57 @@
           <w:color w:val="242424"/>
           <w:sz w:val="20"/>
         </w:rPr>
-        <w:t>회의 처리 화면에서 연결한 AI를 선택합니다.</w:t>
+        <w:t xml:space="preserve">외부 AI로 보낼 내용과 선택한 제공자를 확인한 뒤 </w:t>
+      </w:r>
+      <w:r>
+        <w:rPr>
+          <w:rFonts w:ascii="Malgun Gothic" w:hAnsi="Malgun Gothic" w:eastAsia="Malgun Gothic"/>
+          <w:b/>
+          <w:i w:val="0"/>
+          <w:color w:val="111111"/>
+          <w:sz w:val="19"/>
+        </w:rPr>
+        <w:t>외부 AI 전송 동의</w:t>
+      </w:r>
+      <w:r>
+        <w:rPr>
+          <w:rFonts w:ascii="Malgun Gothic" w:hAnsi="Malgun Gothic" w:eastAsia="Malgun Gothic"/>
+          <w:b w:val="0"/>
+          <w:i w:val="0"/>
+          <w:color w:val="242424"/>
+          <w:sz w:val="20"/>
+        </w:rPr>
+        <w:t>를 켭니다.</w:t>
       </w:r>
     </w:p>
     <w:p>
       <w:pPr>
+        <w:spacing w:after="60"/>
+        <w:ind w:left="317" w:hanging="259"/>
+      </w:pPr>
+      <w:r>
+        <w:rPr>
+          <w:rFonts w:ascii="Malgun Gothic" w:hAnsi="Malgun Gothic" w:eastAsia="Malgun Gothic"/>
+          <w:b/>
+          <w:i w:val="0"/>
+          <w:color w:val="111111"/>
+          <w:sz w:val="20"/>
+        </w:rPr>
+        <w:t xml:space="preserve">5.  </w:t>
+      </w:r>
+      <w:r>
+        <w:rPr>
+          <w:rFonts w:ascii="Malgun Gothic" w:hAnsi="Malgun Gothic" w:eastAsia="Malgun Gothic"/>
+          <w:b w:val="0"/>
+          <w:i w:val="0"/>
+          <w:color w:val="242424"/>
+          <w:sz w:val="20"/>
+        </w:rPr>
+        <w:t>회의 처리 화면에서 연결한 AI를 선택합니다.</w:t>
+      </w:r>
+    </w:p>
+    <w:p>
+      <w:pPr>
         <w:spacing w:after="120"/>
       </w:pPr>
       <w:r>
@@ -4681,7 +4727,7 @@
           <w:color w:val="242424"/>
           <w:sz w:val="20"/>
         </w:rPr>
-        <w:t xml:space="preserve">AI PRONOTE의 </w:t>
+        <w:t xml:space="preserve">PC의 </w:t>
       </w:r>
       <w:r>
         <w:rPr>
@@ -4691,7 +4737,7 @@
           <w:color w:val="111111"/>
           <w:sz w:val="19"/>
         </w:rPr>
-        <w:t>설정 · 어드민</w:t>
+        <w:t>설정 → AI 연결 · 개인 API 키</w:t>
       </w:r>
       <w:r>
         <w:rPr>
@@ -4701,7 +4747,7 @@
           <w:color w:val="242424"/>
           <w:sz w:val="20"/>
         </w:rPr>
-        <w:t>에서 PC에 연결된 공식 API 또는 실험적 계정 로그인 상태를 확인합니다.</w:t>
+        <w:t>에서 공식 API 또는 실험적 계정 로그인 상태를 확인합니다.</w:t>
       </w:r>
     </w:p>
     <w:p>
@@ -4727,73 +4773,7 @@
           <w:color w:val="242424"/>
           <w:sz w:val="20"/>
         </w:rPr>
-        <w:t xml:space="preserve">공식 API 연결이 필요하면 제공자를 선택하고 API 키를 입력한 뒤 </w:t>
-      </w:r>
-      <w:r>
-        <w:rPr>
-          <w:rFonts w:ascii="Malgun Gothic" w:hAnsi="Malgun Gothic" w:eastAsia="Malgun Gothic"/>
-          <w:b/>
-          <w:i w:val="0"/>
-          <w:color w:val="111111"/>
-          <w:sz w:val="19"/>
-        </w:rPr>
-        <w:t>연결 확인</w:t>
-      </w:r>
-      <w:r>
-        <w:rPr>
-          <w:rFonts w:ascii="Malgun Gothic" w:hAnsi="Malgun Gothic" w:eastAsia="Malgun Gothic"/>
-          <w:b w:val="0"/>
-          <w:i w:val="0"/>
-          <w:color w:val="242424"/>
-          <w:sz w:val="20"/>
-        </w:rPr>
-        <w:t>을 실행합니다.</w:t>
-      </w:r>
-    </w:p>
-    <w:p>
-      <w:pPr>
-        <w:spacing w:after="60"/>
-        <w:ind w:left="317" w:hanging="259"/>
-      </w:pPr>
-      <w:r>
-        <w:rPr>
-          <w:rFonts w:ascii="Malgun Gothic" w:hAnsi="Malgun Gothic" w:eastAsia="Malgun Gothic"/>
-          <w:b/>
-          <w:i w:val="0"/>
-          <w:color w:val="111111"/>
-          <w:sz w:val="20"/>
-        </w:rPr>
-        <w:t xml:space="preserve">5.  </w:t>
-      </w:r>
-      <w:r>
-        <w:rPr>
-          <w:rFonts w:ascii="Malgun Gothic" w:hAnsi="Malgun Gothic" w:eastAsia="Malgun Gothic"/>
-          <w:b w:val="0"/>
-          <w:i w:val="0"/>
-          <w:color w:val="242424"/>
-          <w:sz w:val="20"/>
-        </w:rPr>
-        <w:t xml:space="preserve">Claude·Codex 계정 로그인은 AI PRONOTE를 실행하는 PC에서 </w:t>
-      </w:r>
-      <w:r>
-        <w:rPr>
-          <w:rFonts w:ascii="Malgun Gothic" w:hAnsi="Malgun Gothic" w:eastAsia="Malgun Gothic"/>
-          <w:b/>
-          <w:i w:val="0"/>
-          <w:color w:val="111111"/>
-          <w:sz w:val="19"/>
-        </w:rPr>
-        <w:t>2_AI_LOGIN</w:t>
-      </w:r>
-      <w:r>
-        <w:rPr>
-          <w:rFonts w:ascii="Malgun Gothic" w:hAnsi="Malgun Gothic" w:eastAsia="Malgun Gothic"/>
-          <w:b w:val="0"/>
-          <w:i w:val="0"/>
-          <w:color w:val="242424"/>
-          <w:sz w:val="20"/>
-        </w:rPr>
-        <w:t>을 이용합니다.</w:t>
+        <w:t>API 키는 iPad에 입력하거나 저장하지 않습니다. 공식 API 연결과 Claude·Codex 계정 로그인은 AI PRONOTE를 실행하는 PC에서만 설정합니다.</w:t>
       </w:r>
     </w:p>
     <w:p>
@@ -7719,6 +7699,261 @@
           <w:sz w:val="21"/>
         </w:rPr>
         <w:t>를 선택하면 아무 프로세스도 종료하지 않습니다.</w:t>
+      </w:r>
+    </w:p>
+    <w:p>
+      <w:pPr>
+        <w:keepNext/>
+        <w:spacing w:before="200" w:after="100"/>
+      </w:pPr>
+      <w:r>
+        <w:rPr>
+          <w:rFonts w:ascii="Malgun Gothic" w:hAnsi="Malgun Gothic" w:eastAsia="Malgun Gothic"/>
+          <w:b/>
+          <w:i w:val="0"/>
+          <w:color w:val="111111"/>
+          <w:sz w:val="23"/>
+        </w:rPr>
+        <w:t>Windows에서 데이터를 보존하고 제거하기</w:t>
+      </w:r>
+    </w:p>
+    <w:p>
+      <w:pPr>
+        <w:spacing w:after="60"/>
+        <w:ind w:left="317" w:hanging="259"/>
+      </w:pPr>
+      <w:r>
+        <w:rPr>
+          <w:rFonts w:ascii="Malgun Gothic" w:hAnsi="Malgun Gothic" w:eastAsia="Malgun Gothic"/>
+          <w:b/>
+          <w:i w:val="0"/>
+          <w:color w:val="111111"/>
+          <w:sz w:val="20"/>
+        </w:rPr>
+        <w:t xml:space="preserve">1.  </w:t>
+      </w:r>
+      <w:r>
+        <w:rPr>
+          <w:rFonts w:ascii="Malgun Gothic" w:hAnsi="Malgun Gothic" w:eastAsia="Malgun Gothic"/>
+          <w:b w:val="0"/>
+          <w:i w:val="0"/>
+          <w:color w:val="242424"/>
+          <w:sz w:val="20"/>
+        </w:rPr>
+        <w:t xml:space="preserve">진행 중인 녹음·받아쓰기·AI 처리가 없는지 </w:t>
+      </w:r>
+      <w:r>
+        <w:rPr>
+          <w:rFonts w:ascii="Malgun Gothic" w:hAnsi="Malgun Gothic" w:eastAsia="Malgun Gothic"/>
+          <w:b/>
+          <w:i w:val="0"/>
+          <w:color w:val="111111"/>
+          <w:sz w:val="19"/>
+        </w:rPr>
+        <w:t>작업함</w:t>
+      </w:r>
+      <w:r>
+        <w:rPr>
+          <w:rFonts w:ascii="Malgun Gothic" w:hAnsi="Malgun Gothic" w:eastAsia="Malgun Gothic"/>
+          <w:b w:val="0"/>
+          <w:i w:val="0"/>
+          <w:color w:val="242424"/>
+          <w:sz w:val="20"/>
+        </w:rPr>
+        <w:t>에서 확인합니다.</w:t>
+      </w:r>
+    </w:p>
+    <w:p>
+      <w:pPr>
+        <w:spacing w:after="60"/>
+        <w:ind w:left="317" w:hanging="259"/>
+      </w:pPr>
+      <w:r>
+        <w:rPr>
+          <w:rFonts w:ascii="Malgun Gothic" w:hAnsi="Malgun Gothic" w:eastAsia="Malgun Gothic"/>
+          <w:b/>
+          <w:i w:val="0"/>
+          <w:color w:val="111111"/>
+          <w:sz w:val="20"/>
+        </w:rPr>
+        <w:t xml:space="preserve">2.  </w:t>
+      </w:r>
+      <w:r>
+        <w:rPr>
+          <w:rFonts w:ascii="Malgun Gothic" w:hAnsi="Malgun Gothic" w:eastAsia="Malgun Gothic"/>
+          <w:b w:val="0"/>
+          <w:i w:val="0"/>
+          <w:color w:val="242424"/>
+          <w:sz w:val="20"/>
+        </w:rPr>
+        <w:t xml:space="preserve">배포 폴더의 </w:t>
+      </w:r>
+      <w:r>
+        <w:rPr>
+          <w:rFonts w:ascii="Malgun Gothic" w:hAnsi="Malgun Gothic" w:eastAsia="Malgun Gothic"/>
+          <w:b/>
+          <w:i w:val="0"/>
+          <w:color w:val="111111"/>
+          <w:sz w:val="19"/>
+        </w:rPr>
+        <w:t>uninstall_windows.ps1</w:t>
+      </w:r>
+      <w:r>
+        <w:rPr>
+          <w:rFonts w:ascii="Malgun Gothic" w:hAnsi="Malgun Gothic" w:eastAsia="Malgun Gothic"/>
+          <w:b w:val="0"/>
+          <w:i w:val="0"/>
+          <w:color w:val="242424"/>
+          <w:sz w:val="20"/>
+        </w:rPr>
+        <w:t>을 실행합니다.</w:t>
+      </w:r>
+    </w:p>
+    <w:p>
+      <w:pPr>
+        <w:spacing w:after="60"/>
+        <w:ind w:left="317" w:hanging="259"/>
+      </w:pPr>
+      <w:r>
+        <w:rPr>
+          <w:rFonts w:ascii="Malgun Gothic" w:hAnsi="Malgun Gothic" w:eastAsia="Malgun Gothic"/>
+          <w:b/>
+          <w:i w:val="0"/>
+          <w:color w:val="111111"/>
+          <w:sz w:val="20"/>
+        </w:rPr>
+        <w:t xml:space="preserve">3.  </w:t>
+      </w:r>
+      <w:r>
+        <w:rPr>
+          <w:rFonts w:ascii="Malgun Gothic" w:hAnsi="Malgun Gothic" w:eastAsia="Malgun Gothic"/>
+          <w:b w:val="0"/>
+          <w:i w:val="0"/>
+          <w:color w:val="242424"/>
+          <w:sz w:val="20"/>
+        </w:rPr>
+        <w:t xml:space="preserve">프로그램 파일과 AI PRONOTE가 만든 바로가기는 삭제되지 않고 </w:t>
+      </w:r>
+      <w:r>
+        <w:rPr>
+          <w:rFonts w:ascii="Malgun Gothic" w:hAnsi="Malgun Gothic" w:eastAsia="Malgun Gothic"/>
+          <w:b/>
+          <w:i w:val="0"/>
+          <w:color w:val="111111"/>
+          <w:sz w:val="19"/>
+        </w:rPr>
+        <w:t>uninstalled</w:t>
+      </w:r>
+      <w:r>
+        <w:rPr>
+          <w:rFonts w:ascii="Malgun Gothic" w:hAnsi="Malgun Gothic" w:eastAsia="Malgun Gothic"/>
+          <w:b w:val="0"/>
+          <w:i w:val="0"/>
+          <w:color w:val="242424"/>
+          <w:sz w:val="20"/>
+        </w:rPr>
+        <w:t xml:space="preserve"> 보관 폴더로 이동됩니다.</w:t>
+      </w:r>
+    </w:p>
+    <w:p>
+      <w:pPr>
+        <w:spacing w:after="60"/>
+        <w:ind w:left="317" w:hanging="259"/>
+      </w:pPr>
+      <w:r>
+        <w:rPr>
+          <w:rFonts w:ascii="Malgun Gothic" w:hAnsi="Malgun Gothic" w:eastAsia="Malgun Gothic"/>
+          <w:b/>
+          <w:i w:val="0"/>
+          <w:color w:val="111111"/>
+          <w:sz w:val="20"/>
+        </w:rPr>
+        <w:t xml:space="preserve">4.  </w:t>
+      </w:r>
+      <w:r>
+        <w:rPr>
+          <w:rFonts w:ascii="Malgun Gothic" w:hAnsi="Malgun Gothic" w:eastAsia="Malgun Gothic"/>
+          <w:b w:val="0"/>
+          <w:i w:val="0"/>
+          <w:color w:val="242424"/>
+          <w:sz w:val="20"/>
+        </w:rPr>
+        <w:t xml:space="preserve">회의·녹음·노트는 </w:t>
+      </w:r>
+      <w:r>
+        <w:rPr>
+          <w:rFonts w:ascii="Malgun Gothic" w:hAnsi="Malgun Gothic" w:eastAsia="Malgun Gothic"/>
+          <w:b/>
+          <w:i w:val="0"/>
+          <w:color w:val="111111"/>
+          <w:sz w:val="19"/>
+        </w:rPr>
+        <w:t>%LOCALAPPDATA%\AI_PRONOTE\v1.5\data</w:t>
+      </w:r>
+      <w:r>
+        <w:rPr>
+          <w:rFonts w:ascii="Malgun Gothic" w:hAnsi="Malgun Gothic" w:eastAsia="Malgun Gothic"/>
+          <w:b w:val="0"/>
+          <w:i w:val="0"/>
+          <w:color w:val="242424"/>
+          <w:sz w:val="20"/>
+        </w:rPr>
+        <w:t xml:space="preserve">에 남고, 복원 경로는 </w:t>
+      </w:r>
+      <w:r>
+        <w:rPr>
+          <w:rFonts w:ascii="Malgun Gothic" w:hAnsi="Malgun Gothic" w:eastAsia="Malgun Gothic"/>
+          <w:b/>
+          <w:i w:val="0"/>
+          <w:color w:val="111111"/>
+          <w:sz w:val="19"/>
+        </w:rPr>
+        <w:t>restoration-record.json</w:t>
+      </w:r>
+      <w:r>
+        <w:rPr>
+          <w:rFonts w:ascii="Malgun Gothic" w:hAnsi="Malgun Gothic" w:eastAsia="Malgun Gothic"/>
+          <w:b w:val="0"/>
+          <w:i w:val="0"/>
+          <w:color w:val="242424"/>
+          <w:sz w:val="20"/>
+        </w:rPr>
+        <w:t>에 기록됩니다.</w:t>
+      </w:r>
+    </w:p>
+    <w:p>
+      <w:pPr>
+        <w:spacing w:after="120"/>
+      </w:pPr>
+      <w:r>
+        <w:rPr>
+          <w:rFonts w:ascii="Malgun Gothic" w:hAnsi="Malgun Gothic" w:eastAsia="Malgun Gothic"/>
+          <w:b w:val="0"/>
+          <w:i w:val="0"/>
+          <w:color w:val="242424"/>
+          <w:sz w:val="21"/>
+        </w:rPr>
+        <w:t xml:space="preserve">모든 로컬 데이터와 공식 AI API 키까지 지우는 것은 다른 작업입니다. 필요한 백업을 확인한 뒤 </w:t>
+      </w:r>
+      <w:r>
+        <w:rPr>
+          <w:rFonts w:ascii="Malgun Gothic" w:hAnsi="Malgun Gothic" w:eastAsia="Malgun Gothic"/>
+          <w:b/>
+          <w:i w:val="0"/>
+          <w:color w:val="111111"/>
+          <w:sz w:val="20"/>
+        </w:rPr>
+        <w:t>설정 → 이 기기의 AI PRONOTE 데이터 영구 삭제</w:t>
+      </w:r>
+      <w:r>
+        <w:rPr>
+          <w:rFonts w:ascii="Malgun Gothic" w:hAnsi="Malgun Gothic" w:eastAsia="Malgun Gothic"/>
+          <w:b w:val="0"/>
+          <w:i w:val="0"/>
+          <w:color w:val="242424"/>
+          <w:sz w:val="21"/>
+        </w:rPr>
+        <w:t>를 사용하세요.</w:t>
       </w:r>
     </w:p>
     <w:p>

</xml_diff>

<commit_message>
release: align beta13 build 20260920 identity
</commit_message>
<xml_diff>
--- a/docs/AI_PRONOTE_v1.5_Beta13_사용설명서.docx
+++ b/docs/AI_PRONOTE_v1.5_Beta13_사용설명서.docx
@@ -220,7 +220,7 @@
                 <w:color w:val="111111"/>
                 <w:sz w:val="20"/>
               </w:rPr>
-              <w:t>v1.5.0-beta13.20260919</w:t>
+              <w:t>v1.5.0-beta13.20260920</w:t>
             </w:r>
           </w:p>
         </w:tc>
@@ -7305,7 +7305,7 @@
           <w:color w:val="242424"/>
           <w:sz w:val="20"/>
         </w:rPr>
-        <w:t xml:space="preserve">현재 외부 테스트 버전은 </w:t>
+        <w:t xml:space="preserve">현재 외부 테스트 후보 버전은 </w:t>
       </w:r>
       <w:r>
         <w:rPr>
@@ -7315,7 +7315,7 @@
           <w:color w:val="111111"/>
           <w:sz w:val="19"/>
         </w:rPr>
-        <w:t>v1.5.0-beta13.20260919</w:t>
+        <w:t>v1.5.0-beta13.20260920</w:t>
       </w:r>
       <w:r>
         <w:rPr>
@@ -11739,6 +11739,7 @@
   </w:p>
   <w:p>
     <w:pPr>
+      <w:ind w:right="173"/>
       <w:jc w:val="right"/>
     </w:pPr>
     <w:r>

</xml_diff>

<commit_message>
release: ship Windows cold-start fix as beta13.20260920.1
</commit_message>
<xml_diff>
--- a/docs/AI_PRONOTE_v1.5_Beta13_사용설명서.docx
+++ b/docs/AI_PRONOTE_v1.5_Beta13_사용설명서.docx
@@ -220,7 +220,7 @@
                 <w:color w:val="111111"/>
                 <w:sz w:val="20"/>
               </w:rPr>
-              <w:t>v1.5.0-beta13.20260920</w:t>
+              <w:t>v1.5.0-beta13.20260920.1</w:t>
             </w:r>
           </w:p>
         </w:tc>
@@ -7315,7 +7315,7 @@
           <w:color w:val="111111"/>
           <w:sz w:val="19"/>
         </w:rPr>
-        <w:t>v1.5.0-beta13.20260920</w:t>
+        <w:t>v1.5.0-beta13.20260920.1</w:t>
       </w:r>
       <w:r>
         <w:rPr>
@@ -11711,7 +11711,7 @@
     <w:sectPr>
       <w:footerReference w:type="default" r:id="rId9"/>
       <w:pgSz w:w="11909" w:h="16834"/>
-      <w:pgMar w:top="1123" w:right="1181" w:bottom="1037" w:left="1181" w:header="432" w:footer="432" w:gutter="0"/>
+      <w:pgMar w:top="1123" w:right="1181" w:bottom="1411" w:left="1181" w:header="432" w:footer="432" w:gutter="0"/>
       <w:cols w:space="720"/>
       <w:docGrid w:linePitch="360"/>
     </w:sectPr>

</xml_diff>

<commit_message>
release: fix blank home after standalone note
</commit_message>
<xml_diff>
--- a/docs/AI_PRONOTE_v1.5_Beta13_사용설명서.docx
+++ b/docs/AI_PRONOTE_v1.5_Beta13_사용설명서.docx
@@ -220,7 +220,7 @@
                 <w:color w:val="111111"/>
                 <w:sz w:val="20"/>
               </w:rPr>
-              <w:t>v1.5.0-beta13.20260920.1</w:t>
+              <w:t>v1.5.0-beta13.20260920.2</w:t>
             </w:r>
           </w:p>
         </w:tc>
@@ -7315,7 +7315,7 @@
           <w:color w:val="111111"/>
           <w:sz w:val="19"/>
         </w:rPr>
-        <w:t>v1.5.0-beta13.20260920.1</w:t>
+        <w:t>v1.5.0-beta13.20260920.2</w:t>
       </w:r>
       <w:r>
         <w:rPr>

</xml_diff>

<commit_message>
fix: restore keyboard focus after meeting dialog
</commit_message>
<xml_diff>
--- a/docs/AI_PRONOTE_v1.5_Beta13_사용설명서.docx
+++ b/docs/AI_PRONOTE_v1.5_Beta13_사용설명서.docx
@@ -220,7 +220,7 @@
                 <w:color w:val="111111"/>
                 <w:sz w:val="20"/>
               </w:rPr>
-              <w:t>v1.5.0-beta13.20260920.2</w:t>
+              <w:t>v1.5.0-beta13.20260920.3</w:t>
             </w:r>
           </w:p>
         </w:tc>
@@ -7315,7 +7315,7 @@
           <w:color w:val="111111"/>
           <w:sz w:val="19"/>
         </w:rPr>
-        <w:t>v1.5.0-beta13.20260920.2</w:t>
+        <w:t>v1.5.0-beta13.20260920.3</w:t>
       </w:r>
       <w:r>
         <w:rPr>

</xml_diff>

<commit_message>
fix: preserve all final transcription segments
</commit_message>
<xml_diff>
--- a/docs/AI_PRONOTE_v1.5_Beta13_사용설명서.docx
+++ b/docs/AI_PRONOTE_v1.5_Beta13_사용설명서.docx
@@ -220,7 +220,7 @@
                 <w:color w:val="111111"/>
                 <w:sz w:val="20"/>
               </w:rPr>
-              <w:t>v1.5.0-beta13.20260920.3</w:t>
+              <w:t>v1.5.0-beta13.20260920.4</w:t>
             </w:r>
           </w:p>
         </w:tc>
@@ -7315,7 +7315,7 @@
           <w:color w:val="111111"/>
           <w:sz w:val="19"/>
         </w:rPr>
-        <w:t>v1.5.0-beta13.20260920.3</w:t>
+        <w:t>v1.5.0-beta13.20260920.4</w:t>
       </w:r>
       <w:r>
         <w:rPr>

</xml_diff>